<commit_message>
React-Mini App Using Forms & Validations
</commit_message>
<xml_diff>
--- a/ProAzrue Internship Project's Dairy.docx
+++ b/ProAzrue Internship Project's Dairy.docx
@@ -904,25 +904,7 @@
           <w:sz w:val="28"/>
           <w:szCs w:val="28"/>
         </w:rPr>
-        <w:t>Problem: Create a Calculator App using Java Script (</w:t>
-      </w:r>
-      <w:proofErr w:type="spellStart"/>
-      <w:r>
-        <w:rPr>
-          <w:rFonts w:ascii="Arial Narrow" w:hAnsi="Arial Narrow"/>
-          <w:sz w:val="28"/>
-          <w:szCs w:val="28"/>
-        </w:rPr>
-        <w:t>Js</w:t>
-      </w:r>
-      <w:proofErr w:type="spellEnd"/>
-      <w:r>
-        <w:rPr>
-          <w:rFonts w:ascii="Arial Narrow" w:hAnsi="Arial Narrow"/>
-          <w:sz w:val="28"/>
-          <w:szCs w:val="28"/>
-        </w:rPr>
-        <w:t>)</w:t>
+        <w:t>Problem: Create a Calculator App using Java Script (Js)</w:t>
       </w:r>
     </w:p>
     <w:p>
@@ -1511,61 +1493,7 @@
           <w:sz w:val="28"/>
           <w:szCs w:val="28"/>
         </w:rPr>
-        <w:t xml:space="preserve">Problem: Create </w:t>
-      </w:r>
-      <w:proofErr w:type="gramStart"/>
-      <w:r>
-        <w:rPr>
-          <w:rFonts w:ascii="Arial Narrow" w:hAnsi="Arial Narrow"/>
-          <w:sz w:val="28"/>
-          <w:szCs w:val="28"/>
-        </w:rPr>
-        <w:t>an</w:t>
-      </w:r>
-      <w:proofErr w:type="gramEnd"/>
-      <w:r>
-        <w:rPr>
-          <w:rFonts w:ascii="Arial Narrow" w:hAnsi="Arial Narrow"/>
-          <w:sz w:val="28"/>
-          <w:szCs w:val="28"/>
-        </w:rPr>
-        <w:t xml:space="preserve"> first web app using React </w:t>
-      </w:r>
-      <w:proofErr w:type="gramStart"/>
-      <w:r>
-        <w:rPr>
-          <w:rFonts w:ascii="Arial Narrow" w:hAnsi="Arial Narrow"/>
-          <w:sz w:val="28"/>
-          <w:szCs w:val="28"/>
-        </w:rPr>
-        <w:t>And</w:t>
-      </w:r>
-      <w:proofErr w:type="gramEnd"/>
-      <w:r>
-        <w:rPr>
-          <w:rFonts w:ascii="Arial Narrow" w:hAnsi="Arial Narrow"/>
-          <w:sz w:val="28"/>
-          <w:szCs w:val="28"/>
-        </w:rPr>
-        <w:t xml:space="preserve"> </w:t>
-      </w:r>
-      <w:proofErr w:type="spellStart"/>
-      <w:r>
-        <w:rPr>
-          <w:rFonts w:ascii="Arial Narrow" w:hAnsi="Arial Narrow"/>
-          <w:sz w:val="28"/>
-          <w:szCs w:val="28"/>
-        </w:rPr>
-        <w:t>Js</w:t>
-      </w:r>
-      <w:proofErr w:type="spellEnd"/>
-      <w:r>
-        <w:rPr>
-          <w:rFonts w:ascii="Arial Narrow" w:hAnsi="Arial Narrow"/>
-          <w:sz w:val="28"/>
-          <w:szCs w:val="28"/>
-        </w:rPr>
-        <w:t>, &amp; complete homework</w:t>
+        <w:t>Problem: Create an first web app using React And Js, &amp; complete homework</w:t>
       </w:r>
     </w:p>
     <w:p>
@@ -1625,7 +1553,6 @@
         </w:rPr>
         <w:t xml:space="preserve">: </w:t>
       </w:r>
-      <w:proofErr w:type="spellStart"/>
       <w:r>
         <w:rPr>
           <w:rFonts w:ascii="Arial Narrow" w:hAnsi="Arial Narrow"/>
@@ -1634,7 +1561,6 @@
         </w:rPr>
         <w:t>OnLogin</w:t>
       </w:r>
-      <w:proofErr w:type="spellEnd"/>
       <w:r>
         <w:rPr>
           <w:rFonts w:ascii="Arial Narrow" w:hAnsi="Arial Narrow"/>
@@ -2151,7 +2077,6 @@
           <w:szCs w:val="28"/>
         </w:rPr>
       </w:pPr>
-      <w:proofErr w:type="gramStart"/>
       <w:r>
         <w:rPr>
           <w:rFonts w:ascii="Arial Narrow" w:hAnsi="Arial Narrow"/>
@@ -2166,16 +2091,7 @@
           <w:sz w:val="28"/>
           <w:szCs w:val="28"/>
         </w:rPr>
-        <w:t>roblem :</w:t>
-      </w:r>
-      <w:proofErr w:type="gramEnd"/>
-      <w:r>
-        <w:rPr>
-          <w:rFonts w:ascii="Arial Narrow" w:hAnsi="Arial Narrow"/>
-          <w:sz w:val="28"/>
-          <w:szCs w:val="28"/>
-        </w:rPr>
-        <w:t xml:space="preserve"> Create an react app with the business card</w:t>
+        <w:t>roblem : Create an react app with the business card</w:t>
       </w:r>
     </w:p>
     <w:p>
@@ -2468,23 +2384,13 @@
           <w:szCs w:val="28"/>
         </w:rPr>
       </w:pPr>
-      <w:proofErr w:type="gramStart"/>
-      <w:r>
-        <w:rPr>
-          <w:rFonts w:ascii="Arial Narrow" w:hAnsi="Arial Narrow"/>
-          <w:sz w:val="28"/>
-          <w:szCs w:val="28"/>
-        </w:rPr>
-        <w:t>Problem :</w:t>
-      </w:r>
-      <w:proofErr w:type="gramEnd"/>
-      <w:r>
-        <w:rPr>
-          <w:rFonts w:ascii="Arial Narrow" w:hAnsi="Arial Narrow"/>
-          <w:sz w:val="28"/>
-          <w:szCs w:val="28"/>
-        </w:rPr>
-        <w:t xml:space="preserve"> Create an react app having click counter dashboard on it</w:t>
+      <w:r>
+        <w:rPr>
+          <w:rFonts w:ascii="Arial Narrow" w:hAnsi="Arial Narrow"/>
+          <w:sz w:val="28"/>
+          <w:szCs w:val="28"/>
+        </w:rPr>
+        <w:t>Problem : Create an react app having click counter dashboard on it</w:t>
       </w:r>
     </w:p>
     <w:p>
@@ -2776,41 +2682,13 @@
           <w:szCs w:val="28"/>
         </w:rPr>
       </w:pPr>
-      <w:proofErr w:type="gramStart"/>
-      <w:r>
-        <w:rPr>
-          <w:rFonts w:ascii="Arial Narrow" w:hAnsi="Arial Narrow"/>
-          <w:sz w:val="28"/>
-          <w:szCs w:val="28"/>
-        </w:rPr>
-        <w:t>Problem :</w:t>
-      </w:r>
-      <w:proofErr w:type="gramEnd"/>
-      <w:r>
-        <w:rPr>
-          <w:rFonts w:ascii="Arial Narrow" w:hAnsi="Arial Narrow"/>
-          <w:sz w:val="28"/>
-          <w:szCs w:val="28"/>
-        </w:rPr>
-        <w:t xml:space="preserve"> Create an react app having </w:t>
-      </w:r>
-      <w:proofErr w:type="gramStart"/>
-      <w:r>
-        <w:rPr>
-          <w:rFonts w:ascii="Arial Narrow" w:hAnsi="Arial Narrow"/>
-          <w:sz w:val="28"/>
-          <w:szCs w:val="28"/>
-        </w:rPr>
-        <w:t>an</w:t>
-      </w:r>
-      <w:proofErr w:type="gramEnd"/>
-      <w:r>
-        <w:rPr>
-          <w:rFonts w:ascii="Arial Narrow" w:hAnsi="Arial Narrow"/>
-          <w:sz w:val="28"/>
-          <w:szCs w:val="28"/>
-        </w:rPr>
-        <w:t xml:space="preserve"> follow button on it</w:t>
+      <w:r>
+        <w:rPr>
+          <w:rFonts w:ascii="Arial Narrow" w:hAnsi="Arial Narrow"/>
+          <w:sz w:val="28"/>
+          <w:szCs w:val="28"/>
+        </w:rPr>
+        <w:t>Problem : Create an react app having an follow button on it</w:t>
       </w:r>
     </w:p>
     <w:p>
@@ -3094,23 +2972,13 @@
           <w:szCs w:val="28"/>
         </w:rPr>
       </w:pPr>
-      <w:proofErr w:type="gramStart"/>
-      <w:r>
-        <w:rPr>
-          <w:rFonts w:ascii="Arial Narrow" w:hAnsi="Arial Narrow"/>
-          <w:sz w:val="28"/>
-          <w:szCs w:val="28"/>
-        </w:rPr>
-        <w:t>Problem :</w:t>
-      </w:r>
-      <w:proofErr w:type="gramEnd"/>
-      <w:r>
-        <w:rPr>
-          <w:rFonts w:ascii="Arial Narrow" w:hAnsi="Arial Narrow"/>
-          <w:sz w:val="28"/>
-          <w:szCs w:val="28"/>
-        </w:rPr>
-        <w:t xml:space="preserve"> </w:t>
+      <w:r>
+        <w:rPr>
+          <w:rFonts w:ascii="Arial Narrow" w:hAnsi="Arial Narrow"/>
+          <w:sz w:val="28"/>
+          <w:szCs w:val="28"/>
+        </w:rPr>
+        <w:t xml:space="preserve">Problem : </w:t>
       </w:r>
       <w:r>
         <w:rPr>
@@ -3402,23 +3270,13 @@
           <w:szCs w:val="28"/>
         </w:rPr>
       </w:pPr>
-      <w:proofErr w:type="gramStart"/>
-      <w:r>
-        <w:rPr>
-          <w:rFonts w:ascii="Arial Narrow" w:hAnsi="Arial Narrow"/>
-          <w:sz w:val="28"/>
-          <w:szCs w:val="28"/>
-        </w:rPr>
-        <w:t>Problem :</w:t>
-      </w:r>
-      <w:proofErr w:type="gramEnd"/>
-      <w:r>
-        <w:rPr>
-          <w:rFonts w:ascii="Arial Narrow" w:hAnsi="Arial Narrow"/>
-          <w:sz w:val="28"/>
-          <w:szCs w:val="28"/>
-        </w:rPr>
-        <w:t xml:space="preserve"> Create an react app having quiz questions on it</w:t>
+      <w:r>
+        <w:rPr>
+          <w:rFonts w:ascii="Arial Narrow" w:hAnsi="Arial Narrow"/>
+          <w:sz w:val="28"/>
+          <w:szCs w:val="28"/>
+        </w:rPr>
+        <w:t>Problem : Create an react app having quiz questions on it</w:t>
       </w:r>
     </w:p>
     <w:p>
@@ -3711,23 +3569,13 @@
           <w:szCs w:val="28"/>
         </w:rPr>
       </w:pPr>
-      <w:proofErr w:type="gramStart"/>
-      <w:r>
-        <w:rPr>
-          <w:rFonts w:ascii="Arial Narrow" w:hAnsi="Arial Narrow"/>
-          <w:sz w:val="28"/>
-          <w:szCs w:val="28"/>
-        </w:rPr>
-        <w:t>Problem :</w:t>
-      </w:r>
-      <w:proofErr w:type="gramEnd"/>
-      <w:r>
-        <w:rPr>
-          <w:rFonts w:ascii="Arial Narrow" w:hAnsi="Arial Narrow"/>
-          <w:sz w:val="28"/>
-          <w:szCs w:val="28"/>
-        </w:rPr>
-        <w:t xml:space="preserve"> Create an react app having star rating widget in it</w:t>
+      <w:r>
+        <w:rPr>
+          <w:rFonts w:ascii="Arial Narrow" w:hAnsi="Arial Narrow"/>
+          <w:sz w:val="28"/>
+          <w:szCs w:val="28"/>
+        </w:rPr>
+        <w:t>Problem : Create an react app having star rating widget in it</w:t>
       </w:r>
     </w:p>
     <w:p>
@@ -4038,23 +3886,13 @@
           <w:szCs w:val="28"/>
         </w:rPr>
       </w:pPr>
-      <w:proofErr w:type="gramStart"/>
-      <w:r>
-        <w:rPr>
-          <w:rFonts w:ascii="Arial Narrow" w:hAnsi="Arial Narrow"/>
-          <w:sz w:val="28"/>
-          <w:szCs w:val="28"/>
-        </w:rPr>
-        <w:t>Problem :</w:t>
-      </w:r>
-      <w:proofErr w:type="gramEnd"/>
-      <w:r>
-        <w:rPr>
-          <w:rFonts w:ascii="Arial Narrow" w:hAnsi="Arial Narrow"/>
-          <w:sz w:val="28"/>
-          <w:szCs w:val="28"/>
-        </w:rPr>
-        <w:t xml:space="preserve"> Create an react app having team roster grid in it</w:t>
+      <w:r>
+        <w:rPr>
+          <w:rFonts w:ascii="Arial Narrow" w:hAnsi="Arial Narrow"/>
+          <w:sz w:val="28"/>
+          <w:szCs w:val="28"/>
+        </w:rPr>
+        <w:t>Problem : Create an react app having team roster grid in it</w:t>
       </w:r>
     </w:p>
     <w:p>
@@ -4356,23 +4194,13 @@
           <w:szCs w:val="28"/>
         </w:rPr>
       </w:pPr>
-      <w:proofErr w:type="gramStart"/>
-      <w:r>
-        <w:rPr>
-          <w:rFonts w:ascii="Arial Narrow" w:hAnsi="Arial Narrow"/>
-          <w:sz w:val="28"/>
-          <w:szCs w:val="28"/>
-        </w:rPr>
-        <w:t>Problem :</w:t>
-      </w:r>
-      <w:proofErr w:type="gramEnd"/>
-      <w:r>
-        <w:rPr>
-          <w:rFonts w:ascii="Arial Narrow" w:hAnsi="Arial Narrow"/>
-          <w:sz w:val="28"/>
-          <w:szCs w:val="28"/>
-        </w:rPr>
-        <w:t xml:space="preserve"> Create an react app having live working to-do list app</w:t>
+      <w:r>
+        <w:rPr>
+          <w:rFonts w:ascii="Arial Narrow" w:hAnsi="Arial Narrow"/>
+          <w:sz w:val="28"/>
+          <w:szCs w:val="28"/>
+        </w:rPr>
+        <w:t>Problem : Create an react app having live working to-do list app</w:t>
       </w:r>
     </w:p>
     <w:p>
@@ -4431,15 +4259,7 @@
           <w:sz w:val="36"/>
           <w:szCs w:val="36"/>
         </w:rPr>
-        <w:t>1</w:t>
-      </w:r>
-      <w:r>
-        <w:rPr>
-          <w:rFonts w:ascii="Arial Narrow" w:hAnsi="Arial Narrow"/>
-          <w:sz w:val="36"/>
-          <w:szCs w:val="36"/>
-        </w:rPr>
-        <w:t>5</w:t>
+        <w:t>15</w:t>
       </w:r>
       <w:r>
         <w:rPr>
@@ -4455,55 +4275,48 @@
           <w:sz w:val="36"/>
           <w:szCs w:val="36"/>
         </w:rPr>
-        <w:t>usefetch-demo</w:t>
-      </w:r>
-      <w:r>
-        <w:rPr>
-          <w:rFonts w:ascii="Arial Narrow" w:hAnsi="Arial Narrow"/>
-          <w:sz w:val="36"/>
-          <w:szCs w:val="36"/>
-        </w:rPr>
-        <w:t xml:space="preserve"> React App</w:t>
-      </w:r>
-    </w:p>
-    <w:p>
-      <w:pPr>
-        <w:rPr>
-          <w:rFonts w:ascii="Arial Narrow" w:hAnsi="Arial Narrow"/>
-          <w:sz w:val="28"/>
-          <w:szCs w:val="28"/>
-        </w:rPr>
-      </w:pPr>
-    </w:p>
-    <w:p>
-      <w:pPr>
-        <w:rPr>
-          <w:rFonts w:ascii="Arial Narrow" w:hAnsi="Arial Narrow"/>
-          <w:sz w:val="28"/>
-          <w:szCs w:val="28"/>
-        </w:rPr>
-      </w:pPr>
-    </w:p>
-    <w:p>
-      <w:pPr>
-        <w:rPr>
-          <w:rFonts w:ascii="Arial Narrow" w:hAnsi="Arial Narrow"/>
-          <w:sz w:val="28"/>
-          <w:szCs w:val="28"/>
-        </w:rPr>
-      </w:pPr>
-    </w:p>
-    <w:p>
-      <w:pPr>
-        <w:rPr>
-          <w:rFonts w:ascii="Arial Narrow" w:hAnsi="Arial Narrow"/>
-          <w:sz w:val="28"/>
-          <w:szCs w:val="28"/>
-        </w:rPr>
-      </w:pPr>
-      <w:r>
-        <w:rPr>
-          <w:rFonts w:ascii="Arial Narrow" w:hAnsi="Arial Narrow"/>
+        <w:t>usefetch-demo React App</w:t>
+      </w:r>
+    </w:p>
+    <w:p>
+      <w:pPr>
+        <w:rPr>
+          <w:rFonts w:ascii="Arial Narrow" w:hAnsi="Arial Narrow"/>
+          <w:sz w:val="28"/>
+          <w:szCs w:val="28"/>
+        </w:rPr>
+      </w:pPr>
+    </w:p>
+    <w:p>
+      <w:pPr>
+        <w:rPr>
+          <w:rFonts w:ascii="Arial Narrow" w:hAnsi="Arial Narrow"/>
+          <w:sz w:val="28"/>
+          <w:szCs w:val="28"/>
+        </w:rPr>
+      </w:pPr>
+    </w:p>
+    <w:p>
+      <w:pPr>
+        <w:rPr>
+          <w:rFonts w:ascii="Arial Narrow" w:hAnsi="Arial Narrow"/>
+          <w:sz w:val="28"/>
+          <w:szCs w:val="28"/>
+        </w:rPr>
+      </w:pPr>
+    </w:p>
+    <w:p>
+      <w:pPr>
+        <w:rPr>
+          <w:rFonts w:ascii="Arial Narrow" w:hAnsi="Arial Narrow"/>
+          <w:sz w:val="28"/>
+          <w:szCs w:val="28"/>
+        </w:rPr>
+      </w:pPr>
+      <w:r>
+        <w:rPr>
+          <w:rFonts w:ascii="Arial Narrow" w:hAnsi="Arial Narrow"/>
+          <w:noProof/>
           <w:sz w:val="28"/>
           <w:szCs w:val="28"/>
         </w:rPr>
@@ -4687,6 +4500,321 @@
           <w:szCs w:val="28"/>
         </w:rPr>
         <w:t>Problem: Create an react app using “usefetch” in it</w:t>
+      </w:r>
+    </w:p>
+    <w:p>
+      <w:pPr>
+        <w:rPr>
+          <w:rFonts w:ascii="Arial Narrow" w:hAnsi="Arial Narrow"/>
+          <w:sz w:val="28"/>
+          <w:szCs w:val="28"/>
+        </w:rPr>
+      </w:pPr>
+      <w:r>
+        <w:rPr>
+          <w:rFonts w:ascii="Arial Narrow" w:hAnsi="Arial Narrow"/>
+          <w:sz w:val="28"/>
+          <w:szCs w:val="28"/>
+        </w:rPr>
+        <w:br w:type="page"/>
+      </w:r>
+    </w:p>
+    <w:p>
+      <w:pPr>
+        <w:rPr>
+          <w:rFonts w:ascii="Arial Narrow" w:hAnsi="Arial Narrow"/>
+          <w:sz w:val="36"/>
+          <w:szCs w:val="36"/>
+        </w:rPr>
+      </w:pPr>
+      <w:r>
+        <w:rPr>
+          <w:sz w:val="36"/>
+          <w:szCs w:val="36"/>
+        </w:rPr>
+        <w:lastRenderedPageBreak/>
+        <w:t>Pr</w:t>
+      </w:r>
+      <w:r>
+        <w:rPr>
+          <w:rFonts w:ascii="Arial Narrow" w:hAnsi="Arial Narrow"/>
+          <w:sz w:val="36"/>
+          <w:szCs w:val="36"/>
+        </w:rPr>
+        <w:t xml:space="preserve">oject </w:t>
+      </w:r>
+      <w:r>
+        <w:rPr>
+          <w:rFonts w:ascii="Arial Narrow" w:hAnsi="Arial Narrow"/>
+          <w:sz w:val="36"/>
+          <w:szCs w:val="36"/>
+        </w:rPr>
+        <w:t>1</w:t>
+      </w:r>
+      <w:r>
+        <w:rPr>
+          <w:rFonts w:ascii="Arial Narrow" w:hAnsi="Arial Narrow"/>
+          <w:sz w:val="36"/>
+          <w:szCs w:val="36"/>
+        </w:rPr>
+        <w:t>6</w:t>
+      </w:r>
+      <w:r>
+        <w:rPr>
+          <w:rFonts w:ascii="Arial Narrow" w:hAnsi="Arial Narrow"/>
+          <w:sz w:val="36"/>
+          <w:szCs w:val="36"/>
+        </w:rPr>
+        <w:t xml:space="preserve">: </w:t>
+      </w:r>
+      <w:r>
+        <w:rPr>
+          <w:rFonts w:ascii="Arial Narrow" w:hAnsi="Arial Narrow"/>
+          <w:sz w:val="36"/>
+          <w:szCs w:val="36"/>
+        </w:rPr>
+        <w:t>React Mini Project (Multi-steps form)</w:t>
+      </w:r>
+    </w:p>
+    <w:p>
+      <w:pPr>
+        <w:rPr>
+          <w:rFonts w:ascii="Arial Narrow" w:hAnsi="Arial Narrow"/>
+          <w:sz w:val="28"/>
+          <w:szCs w:val="28"/>
+        </w:rPr>
+      </w:pPr>
+    </w:p>
+    <w:p>
+      <w:pPr>
+        <w:rPr>
+          <w:rFonts w:ascii="Arial Narrow" w:hAnsi="Arial Narrow"/>
+          <w:sz w:val="28"/>
+          <w:szCs w:val="28"/>
+        </w:rPr>
+      </w:pPr>
+    </w:p>
+    <w:p>
+      <w:pPr>
+        <w:rPr>
+          <w:rFonts w:ascii="Arial Narrow" w:hAnsi="Arial Narrow"/>
+          <w:sz w:val="28"/>
+          <w:szCs w:val="28"/>
+        </w:rPr>
+      </w:pPr>
+      <w:r>
+        <w:rPr>
+          <w:rFonts w:ascii="Arial Narrow" w:hAnsi="Arial Narrow"/>
+          <w:sz w:val="28"/>
+          <w:szCs w:val="28"/>
+        </w:rPr>
+        <w:drawing>
+          <wp:anchor distT="0" distB="0" distL="114300" distR="114300" simplePos="0" relativeHeight="251674624" behindDoc="0" locked="0" layoutInCell="1" allowOverlap="1" wp14:anchorId="71703D07" wp14:editId="7BE4193E">
+            <wp:simplePos x="0" y="0"/>
+            <wp:positionH relativeFrom="margin">
+              <wp:align>right</wp:align>
+            </wp:positionH>
+            <wp:positionV relativeFrom="paragraph">
+              <wp:posOffset>250190</wp:posOffset>
+            </wp:positionV>
+            <wp:extent cx="5731510" cy="3580130"/>
+            <wp:effectExtent l="0" t="0" r="2540" b="1270"/>
+            <wp:wrapNone/>
+            <wp:docPr id="1180489551" name="Picture 1"/>
+            <wp:cNvGraphicFramePr>
+              <a:graphicFrameLocks xmlns:a="http://schemas.openxmlformats.org/drawingml/2006/main" noChangeAspect="1"/>
+            </wp:cNvGraphicFramePr>
+            <a:graphic xmlns:a="http://schemas.openxmlformats.org/drawingml/2006/main">
+              <a:graphicData uri="http://schemas.openxmlformats.org/drawingml/2006/picture">
+                <pic:pic xmlns:pic="http://schemas.openxmlformats.org/drawingml/2006/picture">
+                  <pic:nvPicPr>
+                    <pic:cNvPr id="1180489551" name=""/>
+                    <pic:cNvPicPr/>
+                  </pic:nvPicPr>
+                  <pic:blipFill>
+                    <a:blip r:embed="rId23" cstate="print">
+                      <a:extLst>
+                        <a:ext uri="{28A0092B-C50C-407E-A947-70E740481C1C}">
+                          <a14:useLocalDpi xmlns:a14="http://schemas.microsoft.com/office/drawing/2010/main" val="0"/>
+                        </a:ext>
+                      </a:extLst>
+                    </a:blip>
+                    <a:stretch>
+                      <a:fillRect/>
+                    </a:stretch>
+                  </pic:blipFill>
+                  <pic:spPr>
+                    <a:xfrm>
+                      <a:off x="0" y="0"/>
+                      <a:ext cx="5731510" cy="3580130"/>
+                    </a:xfrm>
+                    <a:prstGeom prst="rect">
+                      <a:avLst/>
+                    </a:prstGeom>
+                  </pic:spPr>
+                </pic:pic>
+              </a:graphicData>
+            </a:graphic>
+            <wp14:sizeRelH relativeFrom="page">
+              <wp14:pctWidth>0</wp14:pctWidth>
+            </wp14:sizeRelH>
+            <wp14:sizeRelV relativeFrom="page">
+              <wp14:pctHeight>0</wp14:pctHeight>
+            </wp14:sizeRelV>
+          </wp:anchor>
+        </w:drawing>
+      </w:r>
+    </w:p>
+    <w:p>
+      <w:pPr>
+        <w:rPr>
+          <w:rFonts w:ascii="Arial Narrow" w:hAnsi="Arial Narrow"/>
+          <w:sz w:val="28"/>
+          <w:szCs w:val="28"/>
+        </w:rPr>
+      </w:pPr>
+    </w:p>
+    <w:p>
+      <w:pPr>
+        <w:rPr>
+          <w:rFonts w:ascii="Arial Narrow" w:hAnsi="Arial Narrow"/>
+          <w:sz w:val="28"/>
+          <w:szCs w:val="28"/>
+        </w:rPr>
+      </w:pPr>
+    </w:p>
+    <w:p>
+      <w:pPr>
+        <w:rPr>
+          <w:rFonts w:ascii="Arial Narrow" w:hAnsi="Arial Narrow"/>
+          <w:sz w:val="28"/>
+          <w:szCs w:val="28"/>
+        </w:rPr>
+      </w:pPr>
+    </w:p>
+    <w:p>
+      <w:pPr>
+        <w:rPr>
+          <w:rFonts w:ascii="Arial Narrow" w:hAnsi="Arial Narrow"/>
+          <w:sz w:val="28"/>
+          <w:szCs w:val="28"/>
+        </w:rPr>
+      </w:pPr>
+    </w:p>
+    <w:p>
+      <w:pPr>
+        <w:rPr>
+          <w:rFonts w:ascii="Arial Narrow" w:hAnsi="Arial Narrow"/>
+          <w:sz w:val="28"/>
+          <w:szCs w:val="28"/>
+        </w:rPr>
+      </w:pPr>
+    </w:p>
+    <w:p>
+      <w:pPr>
+        <w:rPr>
+          <w:rFonts w:ascii="Arial Narrow" w:hAnsi="Arial Narrow"/>
+          <w:sz w:val="28"/>
+          <w:szCs w:val="28"/>
+        </w:rPr>
+      </w:pPr>
+    </w:p>
+    <w:p>
+      <w:pPr>
+        <w:rPr>
+          <w:rFonts w:ascii="Arial Narrow" w:hAnsi="Arial Narrow"/>
+          <w:sz w:val="28"/>
+          <w:szCs w:val="28"/>
+        </w:rPr>
+      </w:pPr>
+    </w:p>
+    <w:p>
+      <w:pPr>
+        <w:rPr>
+          <w:rFonts w:ascii="Arial Narrow" w:hAnsi="Arial Narrow"/>
+          <w:sz w:val="28"/>
+          <w:szCs w:val="28"/>
+        </w:rPr>
+      </w:pPr>
+    </w:p>
+    <w:p>
+      <w:pPr>
+        <w:rPr>
+          <w:rFonts w:ascii="Arial Narrow" w:hAnsi="Arial Narrow"/>
+          <w:sz w:val="28"/>
+          <w:szCs w:val="28"/>
+        </w:rPr>
+      </w:pPr>
+    </w:p>
+    <w:p>
+      <w:pPr>
+        <w:rPr>
+          <w:rFonts w:ascii="Arial Narrow" w:hAnsi="Arial Narrow"/>
+          <w:sz w:val="28"/>
+          <w:szCs w:val="28"/>
+        </w:rPr>
+      </w:pPr>
+    </w:p>
+    <w:p>
+      <w:pPr>
+        <w:rPr>
+          <w:rFonts w:ascii="Arial Narrow" w:hAnsi="Arial Narrow"/>
+          <w:sz w:val="28"/>
+          <w:szCs w:val="28"/>
+        </w:rPr>
+      </w:pPr>
+    </w:p>
+    <w:p>
+      <w:pPr>
+        <w:rPr>
+          <w:rFonts w:ascii="Arial Narrow" w:hAnsi="Arial Narrow"/>
+          <w:sz w:val="28"/>
+          <w:szCs w:val="28"/>
+        </w:rPr>
+      </w:pPr>
+    </w:p>
+    <w:p>
+      <w:pPr>
+        <w:rPr>
+          <w:rFonts w:ascii="Arial Narrow" w:hAnsi="Arial Narrow"/>
+          <w:sz w:val="28"/>
+          <w:szCs w:val="28"/>
+        </w:rPr>
+      </w:pPr>
+    </w:p>
+    <w:p>
+      <w:pPr>
+        <w:rPr>
+          <w:rFonts w:ascii="Arial Narrow" w:hAnsi="Arial Narrow"/>
+          <w:sz w:val="28"/>
+          <w:szCs w:val="28"/>
+        </w:rPr>
+      </w:pPr>
+    </w:p>
+    <w:p>
+      <w:pPr>
+        <w:rPr>
+          <w:rFonts w:ascii="Arial Narrow" w:hAnsi="Arial Narrow"/>
+          <w:sz w:val="28"/>
+          <w:szCs w:val="28"/>
+        </w:rPr>
+      </w:pPr>
+    </w:p>
+    <w:p>
+      <w:pPr>
+        <w:rPr>
+          <w:rFonts w:ascii="Arial Narrow" w:hAnsi="Arial Narrow"/>
+          <w:sz w:val="28"/>
+          <w:szCs w:val="28"/>
+        </w:rPr>
+      </w:pPr>
+      <w:r>
+        <w:rPr>
+          <w:rFonts w:ascii="Arial Narrow" w:hAnsi="Arial Narrow"/>
+          <w:sz w:val="28"/>
+          <w:szCs w:val="28"/>
+        </w:rPr>
+        <w:t>Problem: Create an react app with using the multi step forms with the real time validations in it</w:t>
       </w:r>
     </w:p>
     <w:sectPr>

</xml_diff>